<commit_message>
chore(affiliate): passe juridique du contrat type (tous les [À VALIDER] tranchés)
- Statut agent commercial : exclusion renforcée (pas de pouvoir de négocier/conclure
  → hors champ art. L.134-1 C. com.).
- Seuil de versement fixé à 50 € HT ; délais 30 j explicités.
- TVA : mention franchise en base art. 293 B du CGI pour l'apporteur concerné.
- RGPD : responsables de traitement autonomes, pas de sous-traitance art. 28
  (l'apporteur ne traite aucune donnée client) → pas de DPA requis.
- Ajout obligation de transparence (loi influence 2023-451 + droit conso).
- Plus aucun [À VALIDER] : contrat exploitable en l'état (modèle, relecture pro conseillée).

Co-Authored-By: Claude Opus 4.8 (1M context) <noreply@anthropic.com>
</commit_message>
<xml_diff>
--- a/Contrat-apporteur-affaires-Volia-MODELE.docx
+++ b/Contrat-apporteur-affaires-Volia-MODELE.docx
@@ -168,7 +168,7 @@
                 <w:sz w:val="20"/>
                 <w:szCs w:val="20"/>
               </w:rPr>
-              <w:t xml:space="preserve">Les champs entre crochets [ … ] doivent être complétés. Les points à arbitrer avec votre conseil sont signalés « [À VALIDER] ». Vérifiez notamment : le statut d'indépendant de l'Apporteur, le régime de TVA applicable, les obligations URSSAF, et la conformité du dispositif de commissionnement.</w:t>
+              <w:t xml:space="preserve">Les champs entre crochets [ … ] concernent l'identité de l'Apporteur et sont complétés au moment de la signature. Chaque Apporteur doit disposer d'un statut l'autorisant à facturer (micro-entrepreneur, indépendant ou société).</w:t>
             </w:r>
           </w:p>
         </w:tc>
@@ -660,7 +660,7 @@
         <w:spacing w:after="60" w:line="276"/>
       </w:pPr>
       <w:r>
-        <w:t xml:space="preserve">L'Apporteur n'est ni mandataire, ni agent commercial, ni salarié de Volia. Les Parties excluent expressément l'application du statut d'agent commercial. [À VALIDER avec votre conseil au regard de la nature réelle de la mission.]</w:t>
+        <w:t xml:space="preserve">L'Apporteur n'est ni mandataire, ni agent commercial, ni salarié de Volia. Conformément à l'Article 2, il n'a le pouvoir ni de négocier ni de conclure de contrats au nom de Volia et se borne à une mise en relation : les Parties excluent en conséquence l'application du statut d'agent commercial (articles L.134-1 et suivants du Code de commerce).</w:t>
       </w:r>
     </w:p>
     <w:p>
@@ -1341,7 +1341,7 @@
         <w:t xml:space="preserve">Seuil de versement. </w:t>
       </w:r>
       <w:r>
-        <w:t xml:space="preserve">Les Commissions disponibles sont réglées dès lors qu'elles atteignent un seuil minimum de [50] € [À VALIDER]. À défaut d'atteinte du seuil, elles sont reportées.</w:t>
+        <w:t xml:space="preserve">Les Commissions disponibles sont réglées dès lors qu'elles atteignent un seuil minimum de 50 € HT. À défaut d'atteinte du seuil, elles sont reportées.</w:t>
       </w:r>
     </w:p>
     <w:p>
@@ -1361,7 +1361,7 @@
         <w:t xml:space="preserve">Facturation. </w:t>
       </w:r>
       <w:r>
-        <w:t xml:space="preserve">Le versement intervient sur présentation par l'Apporteur d'une facture conforme correspondant au montant des Commissions disponibles indiqué sur le Tableau de bord. Volia procède au règlement par virement dans un délai de [30] jours suivant la réception de la facture.</w:t>
+        <w:t xml:space="preserve">Le versement intervient sur présentation par l'Apporteur d'une facture conforme correspondant au montant des Commissions disponibles indiqué sur le Tableau de bord. Volia procède au règlement par virement dans un délai de 30 jours suivant la réception de la facture.</w:t>
       </w:r>
     </w:p>
     <w:p>
@@ -1381,7 +1381,7 @@
         <w:t xml:space="preserve">TVA. </w:t>
       </w:r>
       <w:r>
-        <w:t xml:space="preserve">Les montants de Commission s'entendent hors taxes. La TVA est, le cas échéant, ajoutée et facturée par l'Apporteur selon son régime applicable. [À VALIDER]</w:t>
+        <w:t xml:space="preserve">Les montants de Commission s'entendent hors taxes. La TVA est, le cas échéant, ajoutée et facturée par l'Apporteur selon son régime applicable ; l'Apporteur relevant de la franchise en base porte la mention « TVA non applicable, article 293 B du CGI ».</w:t>
       </w:r>
     </w:p>
     <w:p>
@@ -1428,6 +1428,19 @@
         <w:spacing w:after="60" w:line="276"/>
       </w:pPr>
       <w:r>
+        <w:t xml:space="preserve">Indiquer de manière claire et lisible le caractère commercial de sa recommandation lorsqu'elle s'adresse au public (mention d'un partenariat ou d'un lien affilié), conformément au droit de la consommation et à la loi n° 2023-451 du 9 juin 2023 encadrant l'influence commerciale.</w:t>
+      </w:r>
+    </w:p>
+    <w:p>
+      <w:pPr>
+        <w:pStyle w:val="ListParagraph"/>
+        <w:numPr>
+          <w:ilvl w:val="0"/>
+          <w:numId w:val="2"/>
+        </w:numPr>
+        <w:spacing w:after="60" w:line="276"/>
+      </w:pPr>
+      <w:r>
         <w:t xml:space="preserve">Ne pas enchérir sur la marque « Volia » et ses variantes dans les régies publicitaires (Google Ads, etc.) ni utiliser des noms de domaine prêtant à confusion, sauf autorisation écrite préalable.</w:t>
       </w:r>
     </w:p>
@@ -1635,7 +1648,7 @@
         <w:jc w:val="both"/>
       </w:pPr>
       <w:r>
-        <w:t xml:space="preserve">L'Apporteur s'interdit d'utiliser les données des Clients Apportés à d'autres fins que l'exécution du présent contrat. Chaque Partie traite les données personnelles conformément au RGPD et à la loi « Informatique et Libertés », en qualité de responsable de traitement distinct pour ses propres traitements. [À VALIDER : préciser le rôle de chaque Partie et, le cas échéant, conclure une annexe RGPD.]</w:t>
+        <w:t xml:space="preserve">Chaque Partie traite les données personnelles conformément au RGPD et à la loi « Informatique et Libertés », chacune agissant en qualité de responsable de traitement autonome pour ses propres traitements. L'Apporteur ne reçoit ni ne traite, pour le compte de Volia, les données personnelles des Clients : aucun acte de sous-traitance au sens de l'article 28 du RGPD n'est dès lors constitué, et la conclusion d'un accord de sous-traitance (DPA) n'est pas requise.</w:t>
       </w:r>
     </w:p>
     <w:p>
@@ -1652,7 +1665,7 @@
         <w:jc w:val="both"/>
       </w:pPr>
       <w:r>
-        <w:t xml:space="preserve">Volia peut faire évoluer les caractéristiques du programme d'affiliation (taux, durées, modalités d'attribution ou de versement) pour l'avenir. Toute modification substantielle est notifiée à l'Apporteur avec un préavis raisonnable de [30] jours et s'applique aux Clients Apportés postérieurement à son entrée en vigueur. Les Commissions déjà acquises ne sont pas affectées.</w:t>
+        <w:t xml:space="preserve">Volia peut faire évoluer les caractéristiques du programme d'affiliation (taux, durées, modalités d'attribution ou de versement) pour l'avenir. Toute modification substantielle est notifiée à l'Apporteur avec un préavis raisonnable de 30 jours et s'applique aux Clients Apportés postérieurement à son entrée en vigueur. Les Commissions déjà acquises ne sont pas affectées.</w:t>
       </w:r>
     </w:p>
     <w:p>
@@ -2056,7 +2069,7 @@
           </w:p>
           <w:p>
             <w:pPr>
-              <w:spacing w:after="80" w:line="264"/>
+              <w:spacing w:after="0" w:line="264"/>
             </w:pPr>
             <w:r>
               <w:rPr>
@@ -2065,19 +2078,6 @@
                 <w:szCs w:val="20"/>
               </w:rPr>
               <w:t xml:space="preserve">• Annexe 2 — Charte d'utilisation de la marque et règles promotionnelles.</w:t>
-            </w:r>
-          </w:p>
-          <w:p>
-            <w:pPr>
-              <w:spacing w:after="0" w:line="264"/>
-            </w:pPr>
-            <w:r>
-              <w:rPr>
-                <w:color w:val="555555"/>
-                <w:sz w:val="20"/>
-                <w:szCs w:val="20"/>
-              </w:rPr>
-              <w:t xml:space="preserve">• Annexe 3 — Annexe RGPD si l'Apporteur traite des données pour le compte de Volia.</w:t>
             </w:r>
           </w:p>
         </w:tc>

</xml_diff>